<commit_message>
EHIS-1685 doc gen templates
</commit_message>
<xml_diff>
--- a/PHOCS-Docgentemplates/PHOCS Pool Operating Permit Template.docx
+++ b/PHOCS-Docgentemplates/PHOCS Pool Operating Permit Template.docx
@@ -311,7 +311,6 @@
               </w:rPr>
               <w:t>{{</w:t>
             </w:r>
-            <w:proofErr w:type="spellStart"/>
             <w:r>
               <w:rPr>
                 <w:rFonts w:ascii="Calibri" w:eastAsia="Calibri" w:hAnsi="Calibri" w:cs="Calibri"/>
@@ -320,7 +319,6 @@
               </w:rPr>
               <w:t>BLAccountPhysicalAddress</w:t>
             </w:r>
-            <w:proofErr w:type="spellEnd"/>
             <w:r>
               <w:rPr>
                 <w:rFonts w:ascii="Calibri" w:eastAsia="Calibri" w:hAnsi="Calibri" w:cs="Calibri"/>
@@ -677,17 +675,6 @@
       </w:pPr>
     </w:p>
     <w:p>
-      <w:bookmarkStart w:id="1" w:name="OLE_LINK25"/>
-    </w:p>
-    <w:bookmarkEnd w:id="1"/>
-    <w:p>
-      <w:pPr>
-        <w:rPr>
-          <w:rFonts w:ascii="Calibri" w:hAnsi="Calibri" w:cs="Calibri"/>
-        </w:rPr>
-      </w:pPr>
-    </w:p>
-    <w:p>
       <w:pPr>
         <w:rPr>
           <w:rFonts w:ascii="Calibri" w:hAnsi="Calibri" w:cs="Calibri"/>
@@ -701,33 +688,163 @@
           <w:b/>
           <w:bCs/>
         </w:rPr>
-        <w:t>Conditions on Permit:</w:t>
+        <w:t xml:space="preserve">Conditions on </w:t>
+      </w:r>
+      <w:proofErr w:type="gramStart"/>
+      <w:r>
+        <w:rPr>
+          <w:rFonts w:ascii="Calibri" w:hAnsi="Calibri" w:cs="Calibri"/>
+          <w:b/>
+          <w:bCs/>
+        </w:rPr>
+        <w:t>Permit:</w:t>
+      </w:r>
+      <w:r>
+        <w:rPr>
+          <w:rFonts w:ascii="Calibri" w:hAnsi="Calibri" w:cs="Calibri"/>
+        </w:rPr>
+        <w:t>{</w:t>
+      </w:r>
+      <w:proofErr w:type="gramEnd"/>
+      <w:r>
+        <w:rPr>
+          <w:rFonts w:ascii="Calibri" w:hAnsi="Calibri" w:cs="Calibri"/>
+        </w:rPr>
+        <w:t>{#IF_isConditionNotPresent}}</w:t>
       </w:r>
     </w:p>
     <w:p>
       <w:pPr>
+        <w:pStyle w:val="ListParagraph"/>
+        <w:numPr>
+          <w:ilvl w:val="0"/>
+          <w:numId w:val="15"/>
+        </w:numPr>
+        <w:spacing w:after="0"/>
         <w:rPr>
           <w:rFonts w:ascii="Calibri" w:hAnsi="Calibri" w:cs="Calibri"/>
-          <w:sz w:val="20"/>
-          <w:szCs w:val="20"/>
         </w:rPr>
       </w:pPr>
+      <w:r>
+        <w:rPr>
+          <w:rFonts w:ascii="Calibri" w:hAnsi="Calibri" w:cs="Calibri"/>
+        </w:rPr>
+        <w:t>N</w:t>
+      </w:r>
+      <w:r>
+        <w:rPr>
+          <w:rFonts w:ascii="Calibri" w:hAnsi="Calibri" w:cs="Calibri"/>
+        </w:rPr>
+        <w:t>one</w:t>
+      </w:r>
+      <w:r>
+        <w:rPr>
+          <w:rFonts w:ascii="Calibri" w:hAnsi="Calibri" w:cs="Calibri"/>
+        </w:rPr>
+        <w:t>{{/</w:t>
+      </w:r>
+      <w:proofErr w:type="spellStart"/>
+      <w:r>
+        <w:rPr>
+          <w:rFonts w:ascii="Calibri" w:hAnsi="Calibri" w:cs="Calibri"/>
+        </w:rPr>
+        <w:t>IF_isConditionNotPresent</w:t>
+      </w:r>
+      <w:proofErr w:type="spellEnd"/>
+      <w:r>
+        <w:rPr>
+          <w:rFonts w:ascii="Calibri" w:hAnsi="Calibri" w:cs="Calibri"/>
+        </w:rPr>
+        <w:t>}}</w:t>
+      </w:r>
+      <w:r>
+        <w:rPr>
+          <w:rFonts w:ascii="Calibri" w:hAnsi="Calibri" w:cs="Calibri"/>
+          <w:lang w:val="en-US"/>
+        </w:rPr>
+        <w:t>{{#BusinessLicense}}{{#Conditions}}</w:t>
+      </w:r>
     </w:p>
     <w:p>
       <w:pPr>
+        <w:numPr>
+          <w:ilvl w:val="0"/>
+          <w:numId w:val="14"/>
+        </w:numPr>
         <w:rPr>
           <w:rFonts w:ascii="Calibri" w:hAnsi="Calibri" w:cs="Calibri"/>
-          <w:sz w:val="20"/>
-          <w:szCs w:val="20"/>
+          <w:lang w:val="en-US"/>
         </w:rPr>
       </w:pPr>
+      <w:r>
+        <w:rPr>
+          <w:rFonts w:ascii="Calibri" w:hAnsi="Calibri" w:cs="Calibri"/>
+          <w:lang w:val="en-US"/>
+        </w:rPr>
+        <w:t>{{Description</w:t>
+      </w:r>
+      <w:proofErr w:type="gramStart"/>
+      <w:r>
+        <w:rPr>
+          <w:rFonts w:ascii="Calibri" w:hAnsi="Calibri" w:cs="Calibri"/>
+          <w:lang w:val="en-US"/>
+        </w:rPr>
+        <w:t>}}</w:t>
+      </w:r>
+      <w:r>
+        <w:rPr>
+          <w:rFonts w:ascii="Calibri" w:hAnsi="Calibri" w:cs="Calibri"/>
+          <w:lang w:val="en-US"/>
+        </w:rPr>
+        <w:t>{</w:t>
+      </w:r>
+      <w:proofErr w:type="gramEnd"/>
+      <w:r>
+        <w:rPr>
+          <w:rFonts w:ascii="Calibri" w:hAnsi="Calibri" w:cs="Calibri"/>
+          <w:lang w:val="en-US"/>
+        </w:rPr>
+        <w:t>{/Conditions</w:t>
+      </w:r>
+      <w:proofErr w:type="gramStart"/>
+      <w:r>
+        <w:rPr>
+          <w:rFonts w:ascii="Calibri" w:hAnsi="Calibri" w:cs="Calibri"/>
+          <w:lang w:val="en-US"/>
+        </w:rPr>
+        <w:t>}}{</w:t>
+      </w:r>
+      <w:proofErr w:type="gramEnd"/>
+      <w:r>
+        <w:rPr>
+          <w:rFonts w:ascii="Calibri" w:hAnsi="Calibri" w:cs="Calibri"/>
+          <w:lang w:val="en-US"/>
+        </w:rPr>
+        <w:t>{/</w:t>
+      </w:r>
+      <w:proofErr w:type="spellStart"/>
+      <w:r>
+        <w:rPr>
+          <w:rFonts w:ascii="Calibri" w:hAnsi="Calibri" w:cs="Calibri"/>
+          <w:lang w:val="en-US"/>
+        </w:rPr>
+        <w:t>BusinessLicense</w:t>
+      </w:r>
+      <w:proofErr w:type="spellEnd"/>
+      <w:r>
+        <w:rPr>
+          <w:rFonts w:ascii="Calibri" w:hAnsi="Calibri" w:cs="Calibri"/>
+          <w:lang w:val="en-US"/>
+        </w:rPr>
+        <w:t>}}</w:t>
+      </w:r>
     </w:p>
     <w:p>
       <w:pPr>
+        <w:ind w:left="720"/>
         <w:rPr>
           <w:rFonts w:ascii="Calibri" w:hAnsi="Calibri" w:cs="Calibri"/>
-          <w:sz w:val="20"/>
-          <w:szCs w:val="20"/>
+          <w:lang w:val="en-US"/>
         </w:rPr>
       </w:pPr>
     </w:p>
@@ -1083,12 +1200,8 @@
     </w:p>
     <w:p/>
     <w:sectPr>
-      <w:headerReference w:type="even" r:id="rId11"/>
-      <w:headerReference w:type="default" r:id="rId12"/>
-      <w:footerReference w:type="even" r:id="rId13"/>
-      <w:footerReference w:type="default" r:id="rId14"/>
-      <w:headerReference w:type="first" r:id="rId15"/>
-      <w:footerReference w:type="first" r:id="rId16"/>
+      <w:headerReference w:type="default" r:id="rId11"/>
+      <w:footerReference w:type="default" r:id="rId12"/>
       <w:pgSz w:w="12240" w:h="15840"/>
       <w:pgMar w:top="1440" w:right="1440" w:bottom="1440" w:left="1440" w:header="708" w:footer="708" w:gutter="0"/>
       <w:cols w:space="708"/>
@@ -1119,16 +1232,6 @@
 
 <file path=word/footer1.xml><?xml version="1.0" encoding="utf-8"?>
 <w:ftr xmlns:wpc="http://schemas.microsoft.com/office/word/2010/wordprocessingCanvas" xmlns:cx="http://schemas.microsoft.com/office/drawing/2014/chartex" xmlns:cx1="http://schemas.microsoft.com/office/drawing/2015/9/8/chartex" xmlns:cx2="http://schemas.microsoft.com/office/drawing/2015/10/21/chartex" xmlns:cx3="http://schemas.microsoft.com/office/drawing/2016/5/9/chartex" xmlns:cx4="http://schemas.microsoft.com/office/drawing/2016/5/10/chartex" xmlns:cx5="http://schemas.microsoft.com/office/drawing/2016/5/11/chartex" xmlns:cx6="http://schemas.microsoft.com/office/drawing/2016/5/12/chartex" xmlns:cx7="http://schemas.microsoft.com/office/drawing/2016/5/13/chartex" xmlns:cx8="http://schemas.microsoft.com/office/drawing/2016/5/14/chartex" xmlns:mc="http://schemas.openxmlformats.org/markup-compatibility/2006" xmlns:aink="http://schemas.microsoft.com/office/drawing/2016/ink" xmlns:am3d="http://schemas.microsoft.com/office/drawing/2017/model3d" xmlns:o="urn:schemas-microsoft-com:office:office" xmlns:oel="http://schemas.microsoft.com/office/2019/extlst" xmlns:r="http://schemas.openxmlformats.org/officeDocument/2006/relationships" xmlns:m="http://schemas.openxmlformats.org/officeDocument/2006/math" xmlns:v="urn:schemas-microsoft-com:vml" xmlns:wp14="http://schemas.microsoft.com/office/word/2010/wordprocessingDrawing" xmlns:wp="http://schemas.openxmlformats.org/drawingml/2006/wordprocessingDrawing" xmlns:w10="urn:schemas-microsoft-com:office:word" xmlns:w="http://schemas.openxmlformats.org/wordprocessingml/2006/main" xmlns:w14="http://schemas.microsoft.com/office/word/2010/wordml" xmlns:w15="http://schemas.microsoft.com/office/word/2012/wordml" xmlns:w16cex="http://schemas.microsoft.com/office/word/2018/wordml/cex" xmlns:w16cid="http://schemas.microsoft.com/office/word/2016/wordml/cid" xmlns:w16="http://schemas.microsoft.com/office/word/2018/wordml" xmlns:w16du="http://schemas.microsoft.com/office/word/2023/wordml/word16du" xmlns:w16sdtdh="http://schemas.microsoft.com/office/word/2020/wordml/sdtdatahash" xmlns:w16sdtfl="http://schemas.microsoft.com/office/word/2024/wordml/sdtformatlock" xmlns:w16se="http://schemas.microsoft.com/office/word/2015/wordml/symex" xmlns:wpg="http://schemas.microsoft.com/office/word/2010/wordprocessingGroup" xmlns:wpi="http://schemas.microsoft.com/office/word/2010/wordprocessingInk" xmlns:wne="http://schemas.microsoft.com/office/word/2006/wordml" xmlns:wps="http://schemas.microsoft.com/office/word/2010/wordprocessingShape" mc:Ignorable="w14 w15 w16se w16cid w16 w16cex w16sdtdh w16sdtfl w16du wp14">
-  <w:p>
-    <w:pPr>
-      <w:pStyle w:val="Footer"/>
-    </w:pPr>
-  </w:p>
-</w:ftr>
-</file>
-
-<file path=word/footer2.xml><?xml version="1.0" encoding="utf-8"?>
-<w:ftr xmlns:wpc="http://schemas.microsoft.com/office/word/2010/wordprocessingCanvas" xmlns:cx="http://schemas.microsoft.com/office/drawing/2014/chartex" xmlns:cx1="http://schemas.microsoft.com/office/drawing/2015/9/8/chartex" xmlns:cx2="http://schemas.microsoft.com/office/drawing/2015/10/21/chartex" xmlns:cx3="http://schemas.microsoft.com/office/drawing/2016/5/9/chartex" xmlns:cx4="http://schemas.microsoft.com/office/drawing/2016/5/10/chartex" xmlns:cx5="http://schemas.microsoft.com/office/drawing/2016/5/11/chartex" xmlns:cx6="http://schemas.microsoft.com/office/drawing/2016/5/12/chartex" xmlns:cx7="http://schemas.microsoft.com/office/drawing/2016/5/13/chartex" xmlns:cx8="http://schemas.microsoft.com/office/drawing/2016/5/14/chartex" xmlns:mc="http://schemas.openxmlformats.org/markup-compatibility/2006" xmlns:aink="http://schemas.microsoft.com/office/drawing/2016/ink" xmlns:am3d="http://schemas.microsoft.com/office/drawing/2017/model3d" xmlns:o="urn:schemas-microsoft-com:office:office" xmlns:oel="http://schemas.microsoft.com/office/2019/extlst" xmlns:r="http://schemas.openxmlformats.org/officeDocument/2006/relationships" xmlns:m="http://schemas.openxmlformats.org/officeDocument/2006/math" xmlns:v="urn:schemas-microsoft-com:vml" xmlns:wp14="http://schemas.microsoft.com/office/word/2010/wordprocessingDrawing" xmlns:wp="http://schemas.openxmlformats.org/drawingml/2006/wordprocessingDrawing" xmlns:w10="urn:schemas-microsoft-com:office:word" xmlns:w="http://schemas.openxmlformats.org/wordprocessingml/2006/main" xmlns:w14="http://schemas.microsoft.com/office/word/2010/wordml" xmlns:w15="http://schemas.microsoft.com/office/word/2012/wordml" xmlns:w16cex="http://schemas.microsoft.com/office/word/2018/wordml/cex" xmlns:w16cid="http://schemas.microsoft.com/office/word/2016/wordml/cid" xmlns:w16="http://schemas.microsoft.com/office/word/2018/wordml" xmlns:w16du="http://schemas.microsoft.com/office/word/2023/wordml/word16du" xmlns:w16sdtdh="http://schemas.microsoft.com/office/word/2020/wordml/sdtdatahash" xmlns:w16sdtfl="http://schemas.microsoft.com/office/word/2024/wordml/sdtformatlock" xmlns:w16se="http://schemas.microsoft.com/office/word/2015/wordml/symex" xmlns:wpg="http://schemas.microsoft.com/office/word/2010/wordprocessingGroup" xmlns:wpi="http://schemas.microsoft.com/office/word/2010/wordprocessingInk" xmlns:wne="http://schemas.microsoft.com/office/word/2006/wordml" xmlns:wps="http://schemas.microsoft.com/office/word/2010/wordprocessingShape" mc:Ignorable="w14 w15 w16se w16cid w16 w16cex w16sdtdh w16sdtfl w16du wp14">
   <w:sdt>
     <w:sdtPr>
       <w:rPr>
@@ -1254,16 +1357,6 @@
       <w:rPr>
         <w:rFonts w:ascii="Calibri" w:eastAsia="Calibri" w:hAnsi="Calibri" w:cs="Calibri"/>
       </w:rPr>
-    </w:pPr>
-  </w:p>
-</w:ftr>
-</file>
-
-<file path=word/footer3.xml><?xml version="1.0" encoding="utf-8"?>
-<w:ftr xmlns:wpc="http://schemas.microsoft.com/office/word/2010/wordprocessingCanvas" xmlns:cx="http://schemas.microsoft.com/office/drawing/2014/chartex" xmlns:cx1="http://schemas.microsoft.com/office/drawing/2015/9/8/chartex" xmlns:cx2="http://schemas.microsoft.com/office/drawing/2015/10/21/chartex" xmlns:cx3="http://schemas.microsoft.com/office/drawing/2016/5/9/chartex" xmlns:cx4="http://schemas.microsoft.com/office/drawing/2016/5/10/chartex" xmlns:cx5="http://schemas.microsoft.com/office/drawing/2016/5/11/chartex" xmlns:cx6="http://schemas.microsoft.com/office/drawing/2016/5/12/chartex" xmlns:cx7="http://schemas.microsoft.com/office/drawing/2016/5/13/chartex" xmlns:cx8="http://schemas.microsoft.com/office/drawing/2016/5/14/chartex" xmlns:mc="http://schemas.openxmlformats.org/markup-compatibility/2006" xmlns:aink="http://schemas.microsoft.com/office/drawing/2016/ink" xmlns:am3d="http://schemas.microsoft.com/office/drawing/2017/model3d" xmlns:o="urn:schemas-microsoft-com:office:office" xmlns:oel="http://schemas.microsoft.com/office/2019/extlst" xmlns:r="http://schemas.openxmlformats.org/officeDocument/2006/relationships" xmlns:m="http://schemas.openxmlformats.org/officeDocument/2006/math" xmlns:v="urn:schemas-microsoft-com:vml" xmlns:wp14="http://schemas.microsoft.com/office/word/2010/wordprocessingDrawing" xmlns:wp="http://schemas.openxmlformats.org/drawingml/2006/wordprocessingDrawing" xmlns:w10="urn:schemas-microsoft-com:office:word" xmlns:w="http://schemas.openxmlformats.org/wordprocessingml/2006/main" xmlns:w14="http://schemas.microsoft.com/office/word/2010/wordml" xmlns:w15="http://schemas.microsoft.com/office/word/2012/wordml" xmlns:w16cex="http://schemas.microsoft.com/office/word/2018/wordml/cex" xmlns:w16cid="http://schemas.microsoft.com/office/word/2016/wordml/cid" xmlns:w16="http://schemas.microsoft.com/office/word/2018/wordml" xmlns:w16du="http://schemas.microsoft.com/office/word/2023/wordml/word16du" xmlns:w16sdtdh="http://schemas.microsoft.com/office/word/2020/wordml/sdtdatahash" xmlns:w16sdtfl="http://schemas.microsoft.com/office/word/2024/wordml/sdtformatlock" xmlns:w16se="http://schemas.microsoft.com/office/word/2015/wordml/symex" xmlns:wpg="http://schemas.microsoft.com/office/word/2010/wordprocessingGroup" xmlns:wpi="http://schemas.microsoft.com/office/word/2010/wordprocessingInk" xmlns:wne="http://schemas.microsoft.com/office/word/2006/wordml" xmlns:wps="http://schemas.microsoft.com/office/word/2010/wordprocessingShape" mc:Ignorable="w14 w15 w16se w16cid w16 w16cex w16sdtdh w16sdtfl w16du wp14">
-  <w:p>
-    <w:pPr>
-      <w:pStyle w:val="Footer"/>
     </w:pPr>
   </w:p>
 </w:ftr>
@@ -1289,16 +1382,6 @@
 </file>
 
 <file path=word/header1.xml><?xml version="1.0" encoding="utf-8"?>
-<w:hdr xmlns:wpc="http://schemas.microsoft.com/office/word/2010/wordprocessingCanvas" xmlns:cx="http://schemas.microsoft.com/office/drawing/2014/chartex" xmlns:cx1="http://schemas.microsoft.com/office/drawing/2015/9/8/chartex" xmlns:cx2="http://schemas.microsoft.com/office/drawing/2015/10/21/chartex" xmlns:cx3="http://schemas.microsoft.com/office/drawing/2016/5/9/chartex" xmlns:cx4="http://schemas.microsoft.com/office/drawing/2016/5/10/chartex" xmlns:cx5="http://schemas.microsoft.com/office/drawing/2016/5/11/chartex" xmlns:cx6="http://schemas.microsoft.com/office/drawing/2016/5/12/chartex" xmlns:cx7="http://schemas.microsoft.com/office/drawing/2016/5/13/chartex" xmlns:cx8="http://schemas.microsoft.com/office/drawing/2016/5/14/chartex" xmlns:mc="http://schemas.openxmlformats.org/markup-compatibility/2006" xmlns:aink="http://schemas.microsoft.com/office/drawing/2016/ink" xmlns:am3d="http://schemas.microsoft.com/office/drawing/2017/model3d" xmlns:o="urn:schemas-microsoft-com:office:office" xmlns:oel="http://schemas.microsoft.com/office/2019/extlst" xmlns:r="http://schemas.openxmlformats.org/officeDocument/2006/relationships" xmlns:m="http://schemas.openxmlformats.org/officeDocument/2006/math" xmlns:v="urn:schemas-microsoft-com:vml" xmlns:wp14="http://schemas.microsoft.com/office/word/2010/wordprocessingDrawing" xmlns:wp="http://schemas.openxmlformats.org/drawingml/2006/wordprocessingDrawing" xmlns:w10="urn:schemas-microsoft-com:office:word" xmlns:w="http://schemas.openxmlformats.org/wordprocessingml/2006/main" xmlns:w14="http://schemas.microsoft.com/office/word/2010/wordml" xmlns:w15="http://schemas.microsoft.com/office/word/2012/wordml" xmlns:w16cex="http://schemas.microsoft.com/office/word/2018/wordml/cex" xmlns:w16cid="http://schemas.microsoft.com/office/word/2016/wordml/cid" xmlns:w16="http://schemas.microsoft.com/office/word/2018/wordml" xmlns:w16du="http://schemas.microsoft.com/office/word/2023/wordml/word16du" xmlns:w16sdtdh="http://schemas.microsoft.com/office/word/2020/wordml/sdtdatahash" xmlns:w16sdtfl="http://schemas.microsoft.com/office/word/2024/wordml/sdtformatlock" xmlns:w16se="http://schemas.microsoft.com/office/word/2015/wordml/symex" xmlns:wpg="http://schemas.microsoft.com/office/word/2010/wordprocessingGroup" xmlns:wpi="http://schemas.microsoft.com/office/word/2010/wordprocessingInk" xmlns:wne="http://schemas.microsoft.com/office/word/2006/wordml" xmlns:wps="http://schemas.microsoft.com/office/word/2010/wordprocessingShape" mc:Ignorable="w14 w15 w16se w16cid w16 w16cex w16sdtdh w16sdtfl w16du wp14">
-  <w:p>
-    <w:pPr>
-      <w:pStyle w:val="Header"/>
-    </w:pPr>
-  </w:p>
-</w:hdr>
-</file>
-
-<file path=word/header2.xml><?xml version="1.0" encoding="utf-8"?>
 <w:hdr xmlns:wpc="http://schemas.microsoft.com/office/word/2010/wordprocessingCanvas" xmlns:cx="http://schemas.microsoft.com/office/drawing/2014/chartex" xmlns:cx1="http://schemas.microsoft.com/office/drawing/2015/9/8/chartex" xmlns:cx2="http://schemas.microsoft.com/office/drawing/2015/10/21/chartex" xmlns:cx3="http://schemas.microsoft.com/office/drawing/2016/5/9/chartex" xmlns:cx4="http://schemas.microsoft.com/office/drawing/2016/5/10/chartex" xmlns:cx5="http://schemas.microsoft.com/office/drawing/2016/5/11/chartex" xmlns:cx6="http://schemas.microsoft.com/office/drawing/2016/5/12/chartex" xmlns:cx7="http://schemas.microsoft.com/office/drawing/2016/5/13/chartex" xmlns:cx8="http://schemas.microsoft.com/office/drawing/2016/5/14/chartex" xmlns:mc="http://schemas.openxmlformats.org/markup-compatibility/2006" xmlns:aink="http://schemas.microsoft.com/office/drawing/2016/ink" xmlns:am3d="http://schemas.microsoft.com/office/drawing/2017/model3d" xmlns:o="urn:schemas-microsoft-com:office:office" xmlns:oel="http://schemas.microsoft.com/office/2019/extlst" xmlns:r="http://schemas.openxmlformats.org/officeDocument/2006/relationships" xmlns:m="http://schemas.openxmlformats.org/officeDocument/2006/math" xmlns:v="urn:schemas-microsoft-com:vml" xmlns:wp14="http://schemas.microsoft.com/office/word/2010/wordprocessingDrawing" xmlns:wp="http://schemas.openxmlformats.org/drawingml/2006/wordprocessingDrawing" xmlns:w10="urn:schemas-microsoft-com:office:word" xmlns:w="http://schemas.openxmlformats.org/wordprocessingml/2006/main" xmlns:w14="http://schemas.microsoft.com/office/word/2010/wordml" xmlns:w15="http://schemas.microsoft.com/office/word/2012/wordml" xmlns:w16cex="http://schemas.microsoft.com/office/word/2018/wordml/cex" xmlns:w16cid="http://schemas.microsoft.com/office/word/2016/wordml/cid" xmlns:w16="http://schemas.microsoft.com/office/word/2018/wordml" xmlns:w16du="http://schemas.microsoft.com/office/word/2023/wordml/word16du" xmlns:w16sdtdh="http://schemas.microsoft.com/office/word/2020/wordml/sdtdatahash" xmlns:w16sdtfl="http://schemas.microsoft.com/office/word/2024/wordml/sdtformatlock" xmlns:w16se="http://schemas.microsoft.com/office/word/2015/wordml/symex" xmlns:wpg="http://schemas.microsoft.com/office/word/2010/wordprocessingGroup" xmlns:wpi="http://schemas.microsoft.com/office/word/2010/wordprocessingInk" xmlns:wne="http://schemas.microsoft.com/office/word/2006/wordml" xmlns:wps="http://schemas.microsoft.com/office/word/2010/wordprocessingShape" mc:Ignorable="w14 w15 w16se w16cid w16 w16cex w16sdtdh w16sdtfl w16du wp14">
   <w:tbl>
     <w:tblPr>
@@ -1370,16 +1453,6 @@
 </w:hdr>
 </file>
 
-<file path=word/header3.xml><?xml version="1.0" encoding="utf-8"?>
-<w:hdr xmlns:wpc="http://schemas.microsoft.com/office/word/2010/wordprocessingCanvas" xmlns:cx="http://schemas.microsoft.com/office/drawing/2014/chartex" xmlns:cx1="http://schemas.microsoft.com/office/drawing/2015/9/8/chartex" xmlns:cx2="http://schemas.microsoft.com/office/drawing/2015/10/21/chartex" xmlns:cx3="http://schemas.microsoft.com/office/drawing/2016/5/9/chartex" xmlns:cx4="http://schemas.microsoft.com/office/drawing/2016/5/10/chartex" xmlns:cx5="http://schemas.microsoft.com/office/drawing/2016/5/11/chartex" xmlns:cx6="http://schemas.microsoft.com/office/drawing/2016/5/12/chartex" xmlns:cx7="http://schemas.microsoft.com/office/drawing/2016/5/13/chartex" xmlns:cx8="http://schemas.microsoft.com/office/drawing/2016/5/14/chartex" xmlns:mc="http://schemas.openxmlformats.org/markup-compatibility/2006" xmlns:aink="http://schemas.microsoft.com/office/drawing/2016/ink" xmlns:am3d="http://schemas.microsoft.com/office/drawing/2017/model3d" xmlns:o="urn:schemas-microsoft-com:office:office" xmlns:oel="http://schemas.microsoft.com/office/2019/extlst" xmlns:r="http://schemas.openxmlformats.org/officeDocument/2006/relationships" xmlns:m="http://schemas.openxmlformats.org/officeDocument/2006/math" xmlns:v="urn:schemas-microsoft-com:vml" xmlns:wp14="http://schemas.microsoft.com/office/word/2010/wordprocessingDrawing" xmlns:wp="http://schemas.openxmlformats.org/drawingml/2006/wordprocessingDrawing" xmlns:w10="urn:schemas-microsoft-com:office:word" xmlns:w="http://schemas.openxmlformats.org/wordprocessingml/2006/main" xmlns:w14="http://schemas.microsoft.com/office/word/2010/wordml" xmlns:w15="http://schemas.microsoft.com/office/word/2012/wordml" xmlns:w16cex="http://schemas.microsoft.com/office/word/2018/wordml/cex" xmlns:w16cid="http://schemas.microsoft.com/office/word/2016/wordml/cid" xmlns:w16="http://schemas.microsoft.com/office/word/2018/wordml" xmlns:w16du="http://schemas.microsoft.com/office/word/2023/wordml/word16du" xmlns:w16sdtdh="http://schemas.microsoft.com/office/word/2020/wordml/sdtdatahash" xmlns:w16sdtfl="http://schemas.microsoft.com/office/word/2024/wordml/sdtformatlock" xmlns:w16se="http://schemas.microsoft.com/office/word/2015/wordml/symex" xmlns:wpg="http://schemas.microsoft.com/office/word/2010/wordprocessingGroup" xmlns:wpi="http://schemas.microsoft.com/office/word/2010/wordprocessingInk" xmlns:wne="http://schemas.microsoft.com/office/word/2006/wordml" xmlns:wps="http://schemas.microsoft.com/office/word/2010/wordprocessingShape" mc:Ignorable="w14 w15 w16se w16cid w16 w16cex w16sdtdh w16sdtfl w16du wp14">
-  <w:p>
-    <w:pPr>
-      <w:pStyle w:val="Header"/>
-    </w:pPr>
-  </w:p>
-</w:hdr>
-</file>
-
 <file path=word/intelligence2.xml><?xml version="1.0" encoding="utf-8"?>
 <int2:intelligence xmlns:int2="http://schemas.microsoft.com/office/intelligence/2020/intelligence" xmlns:oel="http://schemas.microsoft.com/office/2019/extlst">
   <int2:observations>
@@ -1842,6 +1915,119 @@
     </w:lvl>
   </w:abstractNum>
   <w:abstractNum w:abstractNumId="3" w15:restartNumberingAfterBreak="0">
+    <w:nsid w:val="1FE60119"/>
+    <w:multiLevelType w:val="hybridMultilevel"/>
+    <w:tmpl w:val="AA3AF858"/>
+    <w:lvl w:ilvl="0" w:tplc="04090001">
+      <w:start w:val="1"/>
+      <w:numFmt w:val="bullet"/>
+      <w:lvlText w:val=""/>
+      <w:lvlJc w:val="left"/>
+      <w:pPr>
+        <w:ind w:left="720" w:hanging="360"/>
+      </w:pPr>
+      <w:rPr>
+        <w:rFonts w:ascii="Symbol" w:hAnsi="Symbol" w:hint="default"/>
+      </w:rPr>
+    </w:lvl>
+    <w:lvl w:ilvl="1" w:tplc="04090003" w:tentative="1">
+      <w:start w:val="1"/>
+      <w:numFmt w:val="bullet"/>
+      <w:lvlText w:val="o"/>
+      <w:lvlJc w:val="left"/>
+      <w:pPr>
+        <w:ind w:left="1440" w:hanging="360"/>
+      </w:pPr>
+      <w:rPr>
+        <w:rFonts w:ascii="Courier New" w:hAnsi="Courier New" w:cs="Courier New" w:hint="default"/>
+      </w:rPr>
+    </w:lvl>
+    <w:lvl w:ilvl="2" w:tplc="04090005" w:tentative="1">
+      <w:start w:val="1"/>
+      <w:numFmt w:val="bullet"/>
+      <w:lvlText w:val=""/>
+      <w:lvlJc w:val="left"/>
+      <w:pPr>
+        <w:ind w:left="2160" w:hanging="360"/>
+      </w:pPr>
+      <w:rPr>
+        <w:rFonts w:ascii="Wingdings" w:hAnsi="Wingdings" w:hint="default"/>
+      </w:rPr>
+    </w:lvl>
+    <w:lvl w:ilvl="3" w:tplc="04090001" w:tentative="1">
+      <w:start w:val="1"/>
+      <w:numFmt w:val="bullet"/>
+      <w:lvlText w:val=""/>
+      <w:lvlJc w:val="left"/>
+      <w:pPr>
+        <w:ind w:left="2880" w:hanging="360"/>
+      </w:pPr>
+      <w:rPr>
+        <w:rFonts w:ascii="Symbol" w:hAnsi="Symbol" w:hint="default"/>
+      </w:rPr>
+    </w:lvl>
+    <w:lvl w:ilvl="4" w:tplc="04090003" w:tentative="1">
+      <w:start w:val="1"/>
+      <w:numFmt w:val="bullet"/>
+      <w:lvlText w:val="o"/>
+      <w:lvlJc w:val="left"/>
+      <w:pPr>
+        <w:ind w:left="3600" w:hanging="360"/>
+      </w:pPr>
+      <w:rPr>
+        <w:rFonts w:ascii="Courier New" w:hAnsi="Courier New" w:cs="Courier New" w:hint="default"/>
+      </w:rPr>
+    </w:lvl>
+    <w:lvl w:ilvl="5" w:tplc="04090005" w:tentative="1">
+      <w:start w:val="1"/>
+      <w:numFmt w:val="bullet"/>
+      <w:lvlText w:val=""/>
+      <w:lvlJc w:val="left"/>
+      <w:pPr>
+        <w:ind w:left="4320" w:hanging="360"/>
+      </w:pPr>
+      <w:rPr>
+        <w:rFonts w:ascii="Wingdings" w:hAnsi="Wingdings" w:hint="default"/>
+      </w:rPr>
+    </w:lvl>
+    <w:lvl w:ilvl="6" w:tplc="04090001" w:tentative="1">
+      <w:start w:val="1"/>
+      <w:numFmt w:val="bullet"/>
+      <w:lvlText w:val=""/>
+      <w:lvlJc w:val="left"/>
+      <w:pPr>
+        <w:ind w:left="5040" w:hanging="360"/>
+      </w:pPr>
+      <w:rPr>
+        <w:rFonts w:ascii="Symbol" w:hAnsi="Symbol" w:hint="default"/>
+      </w:rPr>
+    </w:lvl>
+    <w:lvl w:ilvl="7" w:tplc="04090003" w:tentative="1">
+      <w:start w:val="1"/>
+      <w:numFmt w:val="bullet"/>
+      <w:lvlText w:val="o"/>
+      <w:lvlJc w:val="left"/>
+      <w:pPr>
+        <w:ind w:left="5760" w:hanging="360"/>
+      </w:pPr>
+      <w:rPr>
+        <w:rFonts w:ascii="Courier New" w:hAnsi="Courier New" w:cs="Courier New" w:hint="default"/>
+      </w:rPr>
+    </w:lvl>
+    <w:lvl w:ilvl="8" w:tplc="04090005" w:tentative="1">
+      <w:start w:val="1"/>
+      <w:numFmt w:val="bullet"/>
+      <w:lvlText w:val=""/>
+      <w:lvlJc w:val="left"/>
+      <w:pPr>
+        <w:ind w:left="6480" w:hanging="360"/>
+      </w:pPr>
+      <w:rPr>
+        <w:rFonts w:ascii="Wingdings" w:hAnsi="Wingdings" w:hint="default"/>
+      </w:rPr>
+    </w:lvl>
+  </w:abstractNum>
+  <w:abstractNum w:abstractNumId="4" w15:restartNumberingAfterBreak="0">
     <w:nsid w:val="26AA0A32"/>
     <w:multiLevelType w:val="multilevel"/>
     <w:tmpl w:val="87B261E2"/>
@@ -1990,7 +2176,7 @@
       </w:rPr>
     </w:lvl>
   </w:abstractNum>
-  <w:abstractNum w:abstractNumId="4" w15:restartNumberingAfterBreak="0">
+  <w:abstractNum w:abstractNumId="5" w15:restartNumberingAfterBreak="0">
     <w:nsid w:val="270F2C7D"/>
     <w:multiLevelType w:val="multilevel"/>
     <w:tmpl w:val="D416DDBE"/>
@@ -2139,7 +2325,7 @@
       </w:rPr>
     </w:lvl>
   </w:abstractNum>
-  <w:abstractNum w:abstractNumId="5" w15:restartNumberingAfterBreak="0">
+  <w:abstractNum w:abstractNumId="6" w15:restartNumberingAfterBreak="0">
     <w:nsid w:val="2C207C79"/>
     <w:multiLevelType w:val="multilevel"/>
     <w:tmpl w:val="272055CE"/>
@@ -2288,7 +2474,7 @@
       </w:rPr>
     </w:lvl>
   </w:abstractNum>
-  <w:abstractNum w:abstractNumId="6" w15:restartNumberingAfterBreak="0">
+  <w:abstractNum w:abstractNumId="7" w15:restartNumberingAfterBreak="0">
     <w:nsid w:val="371571CD"/>
     <w:multiLevelType w:val="multilevel"/>
     <w:tmpl w:val="08BED72A"/>
@@ -2437,7 +2623,7 @@
       </w:rPr>
     </w:lvl>
   </w:abstractNum>
-  <w:abstractNum w:abstractNumId="7" w15:restartNumberingAfterBreak="0">
+  <w:abstractNum w:abstractNumId="8" w15:restartNumberingAfterBreak="0">
     <w:nsid w:val="4C5B0CF3"/>
     <w:multiLevelType w:val="multilevel"/>
     <w:tmpl w:val="0F14C080"/>
@@ -2586,7 +2772,7 @@
       </w:rPr>
     </w:lvl>
   </w:abstractNum>
-  <w:abstractNum w:abstractNumId="8" w15:restartNumberingAfterBreak="0">
+  <w:abstractNum w:abstractNumId="9" w15:restartNumberingAfterBreak="0">
     <w:nsid w:val="52194026"/>
     <w:multiLevelType w:val="multilevel"/>
     <w:tmpl w:val="6074C49E"/>
@@ -2735,7 +2921,7 @@
       </w:rPr>
     </w:lvl>
   </w:abstractNum>
-  <w:abstractNum w:abstractNumId="9" w15:restartNumberingAfterBreak="0">
+  <w:abstractNum w:abstractNumId="10" w15:restartNumberingAfterBreak="0">
     <w:nsid w:val="53E77CA1"/>
     <w:multiLevelType w:val="hybridMultilevel"/>
     <w:tmpl w:val="1F1607E4"/>
@@ -2848,7 +3034,7 @@
       </w:rPr>
     </w:lvl>
   </w:abstractNum>
-  <w:abstractNum w:abstractNumId="10" w15:restartNumberingAfterBreak="0">
+  <w:abstractNum w:abstractNumId="11" w15:restartNumberingAfterBreak="0">
     <w:nsid w:val="702E73B8"/>
     <w:multiLevelType w:val="multilevel"/>
     <w:tmpl w:val="39689860"/>
@@ -2997,7 +3183,7 @@
       </w:rPr>
     </w:lvl>
   </w:abstractNum>
-  <w:abstractNum w:abstractNumId="11" w15:restartNumberingAfterBreak="0">
+  <w:abstractNum w:abstractNumId="12" w15:restartNumberingAfterBreak="0">
     <w:nsid w:val="75EE7780"/>
     <w:multiLevelType w:val="multilevel"/>
     <w:tmpl w:val="940282C0"/>
@@ -3146,7 +3332,7 @@
       </w:rPr>
     </w:lvl>
   </w:abstractNum>
-  <w:abstractNum w:abstractNumId="12" w15:restartNumberingAfterBreak="0">
+  <w:abstractNum w:abstractNumId="13" w15:restartNumberingAfterBreak="0">
     <w:nsid w:val="78924622"/>
     <w:multiLevelType w:val="multilevel"/>
     <w:tmpl w:val="6D8057DE"/>
@@ -3295,11 +3481,160 @@
       </w:rPr>
     </w:lvl>
   </w:abstractNum>
+  <w:abstractNum w:abstractNumId="14" w15:restartNumberingAfterBreak="0">
+    <w:nsid w:val="7CFA520C"/>
+    <w:multiLevelType w:val="multilevel"/>
+    <w:tmpl w:val="DD66309A"/>
+    <w:lvl w:ilvl="0">
+      <w:start w:val="1"/>
+      <w:numFmt w:val="bullet"/>
+      <w:lvlText w:val=""/>
+      <w:lvlJc w:val="left"/>
+      <w:pPr>
+        <w:tabs>
+          <w:tab w:val="num" w:pos="720"/>
+        </w:tabs>
+        <w:ind w:left="720" w:hanging="360"/>
+      </w:pPr>
+      <w:rPr>
+        <w:rFonts w:ascii="Symbol" w:hAnsi="Symbol" w:hint="default"/>
+        <w:sz w:val="20"/>
+      </w:rPr>
+    </w:lvl>
+    <w:lvl w:ilvl="1">
+      <w:start w:val="1"/>
+      <w:numFmt w:val="bullet"/>
+      <w:lvlText w:val="o"/>
+      <w:lvlJc w:val="left"/>
+      <w:pPr>
+        <w:tabs>
+          <w:tab w:val="num" w:pos="1440"/>
+        </w:tabs>
+        <w:ind w:left="1440" w:hanging="360"/>
+      </w:pPr>
+      <w:rPr>
+        <w:rFonts w:ascii="Courier New" w:hAnsi="Courier New" w:cs="Times New Roman" w:hint="default"/>
+        <w:sz w:val="20"/>
+      </w:rPr>
+    </w:lvl>
+    <w:lvl w:ilvl="2">
+      <w:start w:val="1"/>
+      <w:numFmt w:val="bullet"/>
+      <w:lvlText w:val=""/>
+      <w:lvlJc w:val="left"/>
+      <w:pPr>
+        <w:tabs>
+          <w:tab w:val="num" w:pos="2160"/>
+        </w:tabs>
+        <w:ind w:left="2160" w:hanging="360"/>
+      </w:pPr>
+      <w:rPr>
+        <w:rFonts w:ascii="Wingdings" w:hAnsi="Wingdings" w:hint="default"/>
+        <w:sz w:val="20"/>
+      </w:rPr>
+    </w:lvl>
+    <w:lvl w:ilvl="3">
+      <w:start w:val="1"/>
+      <w:numFmt w:val="bullet"/>
+      <w:lvlText w:val=""/>
+      <w:lvlJc w:val="left"/>
+      <w:pPr>
+        <w:tabs>
+          <w:tab w:val="num" w:pos="2880"/>
+        </w:tabs>
+        <w:ind w:left="2880" w:hanging="360"/>
+      </w:pPr>
+      <w:rPr>
+        <w:rFonts w:ascii="Wingdings" w:hAnsi="Wingdings" w:hint="default"/>
+        <w:sz w:val="20"/>
+      </w:rPr>
+    </w:lvl>
+    <w:lvl w:ilvl="4">
+      <w:start w:val="1"/>
+      <w:numFmt w:val="bullet"/>
+      <w:lvlText w:val=""/>
+      <w:lvlJc w:val="left"/>
+      <w:pPr>
+        <w:tabs>
+          <w:tab w:val="num" w:pos="3600"/>
+        </w:tabs>
+        <w:ind w:left="3600" w:hanging="360"/>
+      </w:pPr>
+      <w:rPr>
+        <w:rFonts w:ascii="Wingdings" w:hAnsi="Wingdings" w:hint="default"/>
+        <w:sz w:val="20"/>
+      </w:rPr>
+    </w:lvl>
+    <w:lvl w:ilvl="5">
+      <w:start w:val="1"/>
+      <w:numFmt w:val="bullet"/>
+      <w:lvlText w:val=""/>
+      <w:lvlJc w:val="left"/>
+      <w:pPr>
+        <w:tabs>
+          <w:tab w:val="num" w:pos="4320"/>
+        </w:tabs>
+        <w:ind w:left="4320" w:hanging="360"/>
+      </w:pPr>
+      <w:rPr>
+        <w:rFonts w:ascii="Wingdings" w:hAnsi="Wingdings" w:hint="default"/>
+        <w:sz w:val="20"/>
+      </w:rPr>
+    </w:lvl>
+    <w:lvl w:ilvl="6">
+      <w:start w:val="1"/>
+      <w:numFmt w:val="bullet"/>
+      <w:lvlText w:val=""/>
+      <w:lvlJc w:val="left"/>
+      <w:pPr>
+        <w:tabs>
+          <w:tab w:val="num" w:pos="5040"/>
+        </w:tabs>
+        <w:ind w:left="5040" w:hanging="360"/>
+      </w:pPr>
+      <w:rPr>
+        <w:rFonts w:ascii="Wingdings" w:hAnsi="Wingdings" w:hint="default"/>
+        <w:sz w:val="20"/>
+      </w:rPr>
+    </w:lvl>
+    <w:lvl w:ilvl="7">
+      <w:start w:val="1"/>
+      <w:numFmt w:val="bullet"/>
+      <w:lvlText w:val=""/>
+      <w:lvlJc w:val="left"/>
+      <w:pPr>
+        <w:tabs>
+          <w:tab w:val="num" w:pos="5760"/>
+        </w:tabs>
+        <w:ind w:left="5760" w:hanging="360"/>
+      </w:pPr>
+      <w:rPr>
+        <w:rFonts w:ascii="Wingdings" w:hAnsi="Wingdings" w:hint="default"/>
+        <w:sz w:val="20"/>
+      </w:rPr>
+    </w:lvl>
+    <w:lvl w:ilvl="8">
+      <w:start w:val="1"/>
+      <w:numFmt w:val="bullet"/>
+      <w:lvlText w:val=""/>
+      <w:lvlJc w:val="left"/>
+      <w:pPr>
+        <w:tabs>
+          <w:tab w:val="num" w:pos="6480"/>
+        </w:tabs>
+        <w:ind w:left="6480" w:hanging="360"/>
+      </w:pPr>
+      <w:rPr>
+        <w:rFonts w:ascii="Wingdings" w:hAnsi="Wingdings" w:hint="default"/>
+        <w:sz w:val="20"/>
+      </w:rPr>
+    </w:lvl>
+  </w:abstractNum>
   <w:num w:numId="1" w16cid:durableId="377124882">
-    <w:abstractNumId w:val="5"/>
+    <w:abstractNumId w:val="6"/>
   </w:num>
   <w:num w:numId="2" w16cid:durableId="694816240">
-    <w:abstractNumId w:val="4"/>
+    <w:abstractNumId w:val="5"/>
   </w:num>
   <w:num w:numId="3" w16cid:durableId="223682642">
     <w:abstractNumId w:val="2"/>
@@ -3308,31 +3643,37 @@
     <w:abstractNumId w:val="0"/>
   </w:num>
   <w:num w:numId="5" w16cid:durableId="817502845">
+    <w:abstractNumId w:val="12"/>
+  </w:num>
+  <w:num w:numId="6" w16cid:durableId="1116218765">
+    <w:abstractNumId w:val="4"/>
+  </w:num>
+  <w:num w:numId="7" w16cid:durableId="1117063537">
+    <w:abstractNumId w:val="8"/>
+  </w:num>
+  <w:num w:numId="8" w16cid:durableId="676613436">
+    <w:abstractNumId w:val="13"/>
+  </w:num>
+  <w:num w:numId="9" w16cid:durableId="388308014">
     <w:abstractNumId w:val="11"/>
   </w:num>
-  <w:num w:numId="6" w16cid:durableId="1116218765">
-    <w:abstractNumId w:val="3"/>
-  </w:num>
-  <w:num w:numId="7" w16cid:durableId="1117063537">
+  <w:num w:numId="10" w16cid:durableId="347101723">
     <w:abstractNumId w:val="7"/>
   </w:num>
-  <w:num w:numId="8" w16cid:durableId="676613436">
-    <w:abstractNumId w:val="12"/>
-  </w:num>
-  <w:num w:numId="9" w16cid:durableId="388308014">
-    <w:abstractNumId w:val="10"/>
-  </w:num>
-  <w:num w:numId="10" w16cid:durableId="347101723">
-    <w:abstractNumId w:val="6"/>
-  </w:num>
   <w:num w:numId="11" w16cid:durableId="1247422564">
-    <w:abstractNumId w:val="8"/>
+    <w:abstractNumId w:val="9"/>
   </w:num>
   <w:num w:numId="12" w16cid:durableId="669215126">
     <w:abstractNumId w:val="1"/>
   </w:num>
   <w:num w:numId="13" w16cid:durableId="1914660439">
-    <w:abstractNumId w:val="9"/>
+    <w:abstractNumId w:val="10"/>
+  </w:num>
+  <w:num w:numId="14" w16cid:durableId="158205039">
+    <w:abstractNumId w:val="14"/>
+  </w:num>
+  <w:num w:numId="15" w16cid:durableId="1693728512">
+    <w:abstractNumId w:val="3"/>
   </w:num>
 </w:numbering>
 </file>
@@ -3953,6 +4294,7 @@
   <w:style w:type="character" w:default="1" w:styleId="DefaultParagraphFont">
     <w:name w:val="Default Paragraph Font"/>
     <w:uiPriority w:val="1"/>
+    <w:semiHidden/>
     <w:unhideWhenUsed/>
   </w:style>
   <w:style w:type="table" w:default="1" w:styleId="TableNormal">
@@ -4748,21 +5090,10 @@
 </file>
 
 <file path=customXml/item1.xml><?xml version="1.0" encoding="utf-8"?>
-<p:properties xmlns:p="http://schemas.microsoft.com/office/2006/metadata/properties" xmlns:xsi="http://www.w3.org/2001/XMLSchema-instance" xmlns:pc="http://schemas.microsoft.com/office/infopath/2007/PartnerControls">
-  <documentManagement>
-    <TaxCatchAll xmlns="8350b7c0-334b-4e19-bfc1-744f6a979eee" xsi:nil="true"/>
-    <lcf76f155ced4ddcb4097134ff3c332f xmlns="94d5cf59-5162-48bc-aa9b-620df72947f5">
-      <Terms xmlns="http://schemas.microsoft.com/office/infopath/2007/PartnerControls"/>
-    </lcf76f155ced4ddcb4097134ff3c332f>
-  </documentManagement>
-</p:properties>
+<b:Sources xmlns:b="http://schemas.openxmlformats.org/officeDocument/2006/bibliography" xmlns="http://schemas.openxmlformats.org/officeDocument/2006/bibliography" SelectedStyle="\APASixthEditionOfficeOnline.xsl" StyleName="APA" Version="6"/>
 </file>
 
 <file path=customXml/item2.xml><?xml version="1.0" encoding="utf-8"?>
-<b:Sources xmlns:b="http://schemas.openxmlformats.org/officeDocument/2006/bibliography" xmlns="http://schemas.openxmlformats.org/officeDocument/2006/bibliography" SelectedStyle="\APASixthEditionOfficeOnline.xsl" StyleName="APA" Version="6"/>
-</file>
-
-<file path=customXml/item3.xml><?xml version="1.0" encoding="utf-8"?>
 <ct:contentTypeSchema xmlns:ct="http://schemas.microsoft.com/office/2006/metadata/contentType" xmlns:ma="http://schemas.microsoft.com/office/2006/metadata/properties/metaAttributes" ct:_="" ma:_="" ma:contentTypeName="Document" ma:contentTypeID="0x01010015F16144C0593A4A82C8AE0B67DB460F" ma:contentTypeVersion="11" ma:contentTypeDescription="Create a new document." ma:contentTypeScope="" ma:versionID="4c1194c043985d9d73fd9fd33c34a361">
   <xsd:schema xmlns:xsd="http://www.w3.org/2001/XMLSchema" xmlns:xs="http://www.w3.org/2001/XMLSchema" xmlns:p="http://schemas.microsoft.com/office/2006/metadata/properties" xmlns:ns2="94d5cf59-5162-48bc-aa9b-620df72947f5" xmlns:ns3="8350b7c0-334b-4e19-bfc1-744f6a979eee" targetNamespace="http://schemas.microsoft.com/office/2006/metadata/properties" ma:root="true" ma:fieldsID="526f33de6d62635a9e37b477f3e93c98" ns2:_="" ns3:_="">
     <xsd:import namespace="94d5cf59-5162-48bc-aa9b-620df72947f5"/>
@@ -4957,7 +5288,7 @@
 </ct:contentTypeSchema>
 </file>
 
-<file path=customXml/item4.xml><?xml version="1.0" encoding="utf-8"?>
+<file path=customXml/item3.xml><?xml version="1.0" encoding="utf-8"?>
 <?mso-contentType ?>
 <FormTemplates xmlns="http://schemas.microsoft.com/sharepoint/v3/contenttype/forms">
   <Display>DocumentLibraryForm</Display>
@@ -4966,18 +5297,18 @@
 </FormTemplates>
 </file>
 
-<file path=customXml/itemProps1.xml><?xml version="1.0" encoding="utf-8"?>
-<ds:datastoreItem xmlns:ds="http://schemas.openxmlformats.org/officeDocument/2006/customXml" ds:itemID="{025C8078-51DC-4841-BA80-19788F4265C1}">
-  <ds:schemaRefs>
-    <ds:schemaRef ds:uri="http://schemas.microsoft.com/office/2006/metadata/properties"/>
-    <ds:schemaRef ds:uri="http://schemas.microsoft.com/office/infopath/2007/PartnerControls"/>
-    <ds:schemaRef ds:uri="8350b7c0-334b-4e19-bfc1-744f6a979eee"/>
-    <ds:schemaRef ds:uri="94d5cf59-5162-48bc-aa9b-620df72947f5"/>
-  </ds:schemaRefs>
-</ds:datastoreItem>
+<file path=customXml/item4.xml><?xml version="1.0" encoding="utf-8"?>
+<p:properties xmlns:p="http://schemas.microsoft.com/office/2006/metadata/properties" xmlns:xsi="http://www.w3.org/2001/XMLSchema-instance" xmlns:pc="http://schemas.microsoft.com/office/infopath/2007/PartnerControls">
+  <documentManagement>
+    <TaxCatchAll xmlns="8350b7c0-334b-4e19-bfc1-744f6a979eee" xsi:nil="true"/>
+    <lcf76f155ced4ddcb4097134ff3c332f xmlns="94d5cf59-5162-48bc-aa9b-620df72947f5">
+      <Terms xmlns="http://schemas.microsoft.com/office/infopath/2007/PartnerControls"/>
+    </lcf76f155ced4ddcb4097134ff3c332f>
+  </documentManagement>
+</p:properties>
 </file>
 
-<file path=customXml/itemProps2.xml><?xml version="1.0" encoding="utf-8"?>
+<file path=customXml/itemProps1.xml><?xml version="1.0" encoding="utf-8"?>
 <ds:datastoreItem xmlns:ds="http://schemas.openxmlformats.org/officeDocument/2006/customXml" ds:itemID="{05547FD2-9942-43BC-9F0A-00017A93FCEF}">
   <ds:schemaRefs>
     <ds:schemaRef ds:uri="http://schemas.openxmlformats.org/officeDocument/2006/bibliography"/>
@@ -4985,7 +5316,7 @@
 </ds:datastoreItem>
 </file>
 
-<file path=customXml/itemProps3.xml><?xml version="1.0" encoding="utf-8"?>
+<file path=customXml/itemProps2.xml><?xml version="1.0" encoding="utf-8"?>
 <ds:datastoreItem xmlns:ds="http://schemas.openxmlformats.org/officeDocument/2006/customXml" ds:itemID="{7FE69CF3-78CE-4B21-BEBB-74601EDDD5AC}">
   <ds:schemaRefs>
     <ds:schemaRef ds:uri="http://schemas.microsoft.com/office/2006/metadata/contentType"/>
@@ -5004,10 +5335,21 @@
 </ds:datastoreItem>
 </file>
 
-<file path=customXml/itemProps4.xml><?xml version="1.0" encoding="utf-8"?>
+<file path=customXml/itemProps3.xml><?xml version="1.0" encoding="utf-8"?>
 <ds:datastoreItem xmlns:ds="http://schemas.openxmlformats.org/officeDocument/2006/customXml" ds:itemID="{EBC42ABD-C067-4102-BEC1-787B36D5DB6C}">
   <ds:schemaRefs>
     <ds:schemaRef ds:uri="http://schemas.microsoft.com/sharepoint/v3/contenttype/forms"/>
+  </ds:schemaRefs>
+</ds:datastoreItem>
+</file>
+
+<file path=customXml/itemProps4.xml><?xml version="1.0" encoding="utf-8"?>
+<ds:datastoreItem xmlns:ds="http://schemas.openxmlformats.org/officeDocument/2006/customXml" ds:itemID="{025C8078-51DC-4841-BA80-19788F4265C1}">
+  <ds:schemaRefs>
+    <ds:schemaRef ds:uri="http://schemas.microsoft.com/office/2006/metadata/properties"/>
+    <ds:schemaRef ds:uri="http://schemas.microsoft.com/office/infopath/2007/PartnerControls"/>
+    <ds:schemaRef ds:uri="8350b7c0-334b-4e19-bfc1-744f6a979eee"/>
+    <ds:schemaRef ds:uri="94d5cf59-5162-48bc-aa9b-620df72947f5"/>
   </ds:schemaRefs>
 </ds:datastoreItem>
 </file>

</xml_diff>